<commit_message>
Add Streamlit deployment evidence to submission docs
</commit_message>
<xml_diff>
--- a/final_submission/示例输出_财务分析报告.docx
+++ b/final_submission/示例输出_财务分析报告.docx
@@ -7,12 +7,12 @@
         <w:pStyle w:val="Heading1"/>
       </w:pPr>
       <w:r>
-        <w:t>科大讯飞股份有限公司 财务报表分析报告</w:t>
+        <w:t>用户上传公司 财务报表分析报告</w:t>
       </w:r>
     </w:p>
     <w:p>
       <w:r>
-        <w:t>报告期间：2024 年度至 2025 年度</w:t>
+        <w:t>报告期间：2022 年度至 2024 年度</w:t>
       </w:r>
     </w:p>
     <w:p>
@@ -27,7 +27,7 @@
     </w:p>
     <w:p>
       <w:r>
-        <w:t>数据来源：标准财务数据、PDF 年报文本</w:t>
+        <w:t>数据来源：标准财务数据</w:t>
       </w:r>
     </w:p>
     <w:p>
@@ -45,7 +45,7 @@
     </w:p>
     <w:p>
       <w:r>
-        <w:t>本报告基于已确认的标准财务数据生成。PDF 年报解析识别公司名称为：科大讯飞股份有限公司。</w:t>
+        <w:t>本报告基于已确认的标准财务数据生成。未使用 PDF 年报或 PDF 解析未成功，系统基于标准财务数据完成核心分析。</w:t>
       </w:r>
     </w:p>
     <w:p>
@@ -71,7 +71,7 @@
     </w:p>
     <w:p>
       <w:r>
-        <w:t>数据校验完成：通过 7 项，关注 0 项，异常 0 项。</w:t>
+        <w:t>数据校验完成：通过 10 项，关注 0 项，异常 0 项。</w:t>
       </w:r>
     </w:p>
     <w:p>
@@ -87,7 +87,55 @@
         <w:pStyle w:val="ListBullet"/>
       </w:pPr>
       <w:r>
-        <w:t>2024｜资产负债表勾稽关系｜通过：总资产 41,478,899,803.20；总负债+所有者权益 41,478,899,803.20；差异 -0.00。差异率 0.00%，在 1% 容忍范围内。 建议：若差异较大，请检查单位、合并/母公司口径和是否遗漏少数股东权益等项目。</w:t>
+        <w:t>2022｜资产负债表勾稽关系｜通过：总资产 310,000.00；总负债+所有者权益 310,000.00；差异 0.00。差异率 0.00%，在 1% 容忍范围内。 建议：若差异较大，请检查单位、合并/母公司口径和是否遗漏少数股东权益等项目。</w:t>
+      </w:r>
+    </w:p>
+    <w:p>
+      <w:pPr>
+        <w:pStyle w:val="ListBullet"/>
+      </w:pPr>
+      <w:r>
+        <w:t>2022｜利润表基础合理性｜通过：营业收入、营业成本和净利润未触发基础异常校验。 建议：可继续结合盈利能力指标和趋势变化判断利润质量。</w:t>
+      </w:r>
+    </w:p>
+    <w:p>
+      <w:pPr>
+        <w:pStyle w:val="ListBullet"/>
+      </w:pPr>
+      <w:r>
+        <w:t>2022｜利润现金流匹配性｜通过：净利润与经营活动现金流量净额未触发基础背离校验。 建议：仍需结合净利润现金含量和营运资金占用进一步判断。</w:t>
+      </w:r>
+    </w:p>
+    <w:p>
+      <w:pPr>
+        <w:pStyle w:val="ListBullet"/>
+      </w:pPr>
+      <w:r>
+        <w:t>2023｜资产负债表勾稽关系｜通过：总资产 365,000.00；总负债+所有者权益 365,000.00；差异 0.00。差异率 0.00%，在 1% 容忍范围内。 建议：若差异较大，请检查单位、合并/母公司口径和是否遗漏少数股东权益等项目。</w:t>
+      </w:r>
+    </w:p>
+    <w:p>
+      <w:pPr>
+        <w:pStyle w:val="ListBullet"/>
+      </w:pPr>
+      <w:r>
+        <w:t>2023｜利润表基础合理性｜通过：营业收入、营业成本和净利润未触发基础异常校验。 建议：可继续结合盈利能力指标和趋势变化判断利润质量。</w:t>
+      </w:r>
+    </w:p>
+    <w:p>
+      <w:pPr>
+        <w:pStyle w:val="ListBullet"/>
+      </w:pPr>
+      <w:r>
+        <w:t>2023｜利润现金流匹配性｜通过：净利润与经营活动现金流量净额未触发基础背离校验。 建议：仍需结合净利润现金含量和营运资金占用进一步判断。</w:t>
+      </w:r>
+    </w:p>
+    <w:p>
+      <w:pPr>
+        <w:pStyle w:val="ListBullet"/>
+      </w:pPr>
+      <w:r>
+        <w:t>2024｜资产负债表勾稽关系｜通过：总资产 430,000.00；总负债+所有者权益 430,000.00；差异 0.00。差异率 0.00%，在 1% 容忍范围内。 建议：若差异较大，请检查单位、合并/母公司口径和是否遗漏少数股东权益等项目。</w:t>
       </w:r>
     </w:p>
     <w:p>
@@ -108,30 +156,6 @@
     </w:p>
     <w:p>
       <w:pPr>
-        <w:pStyle w:val="ListBullet"/>
-      </w:pPr>
-      <w:r>
-        <w:t>2025｜资产负债表勾稽关系｜通过：总资产 44,857,109,349.34；总负债+所有者权益 44,857,109,349.34；差异 -0.00。差异率 0.00%，在 1% 容忍范围内。 建议：若差异较大，请检查单位、合并/母公司口径和是否遗漏少数股东权益等项目。</w:t>
-      </w:r>
-    </w:p>
-    <w:p>
-      <w:pPr>
-        <w:pStyle w:val="ListBullet"/>
-      </w:pPr>
-      <w:r>
-        <w:t>2025｜利润表基础合理性｜通过：营业收入、营业成本和净利润未触发基础异常校验。 建议：可继续结合盈利能力指标和趋势变化判断利润质量。</w:t>
-      </w:r>
-    </w:p>
-    <w:p>
-      <w:pPr>
-        <w:pStyle w:val="ListBullet"/>
-      </w:pPr>
-      <w:r>
-        <w:t>2025｜利润现金流匹配性｜通过：净利润与经营活动现金流量净额未触发基础背离校验。 建议：仍需结合净利润现金含量和营运资金占用进一步判断。</w:t>
-      </w:r>
-    </w:p>
-    <w:p>
-      <w:pPr>
         <w:pStyle w:val="Heading2"/>
       </w:pPr>
       <w:r>
@@ -143,7 +167,7 @@
         <w:pStyle w:val="ListBullet"/>
       </w:pPr>
       <w:r>
-        <w:t>营业收入增长率（2025）：16.12%</w:t>
+        <w:t>营业收入增长率（2024）：11.72%</w:t>
       </w:r>
     </w:p>
     <w:p>
@@ -151,7 +175,7 @@
         <w:pStyle w:val="ListBullet"/>
       </w:pPr>
       <w:r>
-        <w:t>净利润增长率（2025）：67.54%</w:t>
+        <w:t>净利润增长率（2024）：-6.74%</w:t>
       </w:r>
     </w:p>
     <w:p>
@@ -159,7 +183,7 @@
         <w:pStyle w:val="ListBullet"/>
       </w:pPr>
       <w:r>
-        <w:t>资产负债率（2025）：55.72%</w:t>
+        <w:t>资产负债率（2024）：52.33%</w:t>
       </w:r>
     </w:p>
     <w:p>
@@ -167,7 +191,7 @@
         <w:pStyle w:val="ListBullet"/>
       </w:pPr>
       <w:r>
-        <w:t>净资产收益率（ROE）（2025）：4.40%</w:t>
+        <w:t>净资产收益率（ROE）（2024）：8.30%</w:t>
       </w:r>
     </w:p>
     <w:p>
@@ -175,7 +199,7 @@
         <w:pStyle w:val="ListBullet"/>
       </w:pPr>
       <w:r>
-        <w:t>净利润现金含量（2025）：377.66%</w:t>
+        <w:t>净利润现金含量（2024）：59.04%</w:t>
       </w:r>
     </w:p>
     <w:p>
@@ -183,7 +207,7 @@
         <w:pStyle w:val="ListBullet"/>
       </w:pPr>
       <w:r>
-        <w:t>营业收入2025年为27,105,390,547.66，较2024年增加16.12%。</w:t>
+        <w:t>营业收入2024年为162,000.00，较2023年增加11.72%。</w:t>
       </w:r>
     </w:p>
     <w:p>
@@ -191,7 +215,7 @@
         <w:pStyle w:val="ListBullet"/>
       </w:pPr>
       <w:r>
-        <w:t>净利润2025年为849,468,620.24，较2024年增加67.54%。</w:t>
+        <w:t>净利润2024年为16,600.00，较2023年减少6.74%。</w:t>
       </w:r>
     </w:p>
     <w:p>
@@ -199,7 +223,7 @@
         <w:pStyle w:val="ListBullet"/>
       </w:pPr>
       <w:r>
-        <w:t>经营活动现金流量净额2025年为3,208,095,271.78，较2024年增加28.57%。</w:t>
+        <w:t>经营活动现金流量净额2024年为9,800.00，较2023年减少21.60%。</w:t>
       </w:r>
     </w:p>
     <w:p>
@@ -207,7 +231,7 @@
         <w:pStyle w:val="ListBullet"/>
       </w:pPr>
       <w:r>
-        <w:t>总资产2025年为44,857,109,349.34，较2024年增加8.14%。</w:t>
+        <w:t>总资产2024年为430,000.00，较2023年增加17.81%。</w:t>
       </w:r>
     </w:p>
     <w:p>
@@ -220,7 +244,7 @@
         <w:pStyle w:val="ListBullet"/>
       </w:pPr>
       <w:r>
-        <w:t>营业收入：上升，2024 年至 2025 年累计变动 16.12%。</w:t>
+        <w:t>营业收入：上升，2022 年至 2024 年累计变动 35.00%。</w:t>
       </w:r>
     </w:p>
     <w:p>
@@ -228,7 +252,7 @@
         <w:pStyle w:val="ListBullet"/>
       </w:pPr>
       <w:r>
-        <w:t>净利润：上升，2024 年至 2025 年累计变动 67.54%。</w:t>
+        <w:t>净利润：波动，2022 年至 2024 年累计变动 14.48%。</w:t>
       </w:r>
     </w:p>
     <w:p>
@@ -236,7 +260,7 @@
         <w:pStyle w:val="ListBullet"/>
       </w:pPr>
       <w:r>
-        <w:t>经营活动现金流量净额：上升，2024 年至 2025 年累计变动 28.57%。</w:t>
+        <w:t>经营活动现金流量净额：下降，2022 年至 2024 年累计变动 -38.75%。</w:t>
       </w:r>
     </w:p>
     <w:p>
@@ -244,7 +268,7 @@
         <w:pStyle w:val="ListBullet"/>
       </w:pPr>
       <w:r>
-        <w:t>总资产：上升，2024 年至 2025 年累计变动 8.14%。</w:t>
+        <w:t>总资产：上升，2022 年至 2024 年累计变动 38.71%。</w:t>
       </w:r>
     </w:p>
     <w:p>
@@ -257,27 +281,27 @@
     </w:p>
     <w:p>
       <w:r>
-        <w:t>总资产2025年为44,857,109,349.34，较2024年增加8.14%。</w:t>
+        <w:t>总资产2024年为430,000.00，较2023年增加17.81%。</w:t>
       </w:r>
     </w:p>
     <w:p>
       <w:r>
-        <w:t>总负债2025年为24,994,625,192.65，较2024年增加9.80%。</w:t>
+        <w:t>总负债2024年为225,000.00，较2023年增加32.35%。</w:t>
       </w:r>
     </w:p>
     <w:p>
       <w:r>
-        <w:t>所有者权益2025年为19,862,484,156.69，较2024年增加6.13%。</w:t>
+        <w:t>所有者权益2024年为205,000.00，较2023年增加5.13%。</w:t>
       </w:r>
     </w:p>
     <w:p>
       <w:r>
-        <w:t>资产负债率2025年为55.72%，较2024年上升0.84个百分点。</w:t>
+        <w:t>资产负债率2024年为52.33%，较2023年上升5.75个百分点。</w:t>
       </w:r>
     </w:p>
     <w:p>
       <w:r>
-        <w:t>权益乘数2025年为2.26，较2024年上升1.90%。</w:t>
+        <w:t>权益乘数2024年为2.10，较2023年上升12.06%。</w:t>
       </w:r>
     </w:p>
     <w:p>
@@ -295,27 +319,27 @@
     </w:p>
     <w:p>
       <w:r>
-        <w:t>营业收入2025年为27,105,390,547.66，较2024年增加16.12%。</w:t>
+        <w:t>营业收入2024年为162,000.00，较2023年增加11.72%。</w:t>
       </w:r>
     </w:p>
     <w:p>
       <w:r>
-        <w:t>营业成本2025年为15,624,405,247.68，较2024年增加16.68%。</w:t>
+        <w:t>营业成本2024年为108,000.00，较2023年增加17.39%。</w:t>
       </w:r>
     </w:p>
     <w:p>
       <w:r>
-        <w:t>净利润2025年为849,468,620.24，较2024年增加67.54%。</w:t>
+        <w:t>净利润2024年为16,600.00，较2023年减少6.74%。</w:t>
       </w:r>
     </w:p>
     <w:p>
       <w:r>
-        <w:t>毛利率2025年为42.36%，较2024年下降0.28个百分点。</w:t>
+        <w:t>毛利率2024年为33.33%，较2023年下降3.22个百分点。</w:t>
       </w:r>
     </w:p>
     <w:p>
       <w:r>
-        <w:t>净利率2025年为3.13%，较2024年上升0.96个百分点。</w:t>
+        <w:t>净利率2024年为10.25%，较2023年下降2.03个百分点。</w:t>
       </w:r>
     </w:p>
     <w:p>
@@ -333,27 +357,27 @@
     </w:p>
     <w:p>
       <w:r>
-        <w:t>经营活动现金流量净额2025年为3,208,095,271.78，较2024年增加28.57%。</w:t>
+        <w:t>经营活动现金流量净额2024年为9,800.00，较2023年减少21.60%。</w:t>
       </w:r>
     </w:p>
     <w:p>
       <w:r>
-        <w:t>净利润现金含量2025年为377.66%，较2024年下降114.45个百分点。</w:t>
+        <w:t>净利润现金含量2024年为59.04%，较2023年下降11.19个百分点。</w:t>
       </w:r>
     </w:p>
     <w:p>
       <w:r>
-        <w:t>销售收现比率2025年为101.13%，较2024年上升2.99个百分点。</w:t>
+        <w:t>销售收现比率2024年为97.53%，较2023年下降5.92个百分点。</w:t>
       </w:r>
     </w:p>
     <w:p>
       <w:r>
-        <w:t>经营现金流量收入比率2025年为11.84%，较2024年上升1.15个百分点。</w:t>
+        <w:t>经营现金流量收入比率2024年为6.05%，较2023年下降2.57个百分点。</w:t>
       </w:r>
     </w:p>
     <w:p>
       <w:r>
-        <w:t>经营活动现金流量净额与净利润整体匹配度尚可，仍需结合行业结算模式判断。</w:t>
+        <w:t>净利润现金含量连续低于 100%，提示利润现金含量需要关注。 经营活动现金流量净额呈下降趋势，需结合应收账款、存货和收入确认质量进一步分析。</w:t>
       </w:r>
     </w:p>
     <w:p>
@@ -371,22 +395,22 @@
     </w:p>
     <w:p>
       <w:r>
-        <w:t>流动比率2025年为1.37，较2024年下降12.71%。</w:t>
+        <w:t>流动比率2024年为1.66，较2023年下降8.07%。</w:t>
       </w:r>
     </w:p>
     <w:p>
       <w:r>
-        <w:t>速动比率2025年为1.20，较2024年下降12.80%。</w:t>
+        <w:t>速动比率2024年为0.98，较2023年下降21.26%。</w:t>
       </w:r>
     </w:p>
     <w:p>
       <w:r>
-        <w:t>资产负债率2025年为55.72%，较2024年上升0.84个百分点。</w:t>
+        <w:t>资产负债率2024年为52.33%，较2023年上升5.75个百分点。</w:t>
       </w:r>
     </w:p>
     <w:p>
       <w:r>
-        <w:t>权益乘数2025年为2.26，较2024年上升1.90%。</w:t>
+        <w:t>权益乘数2024年为2.10，较2023年上升12.06%。</w:t>
       </w:r>
     </w:p>
     <w:p>
@@ -404,17 +428,17 @@
     </w:p>
     <w:p>
       <w:r>
-        <w:t>应收账款周转率2025年为1.75，较2024年上升10.01%。</w:t>
+        <w:t>应收账款周转率2024年为3.15，较2023年下降27.33%。</w:t>
       </w:r>
     </w:p>
     <w:p>
       <w:r>
-        <w:t>存货周转率2025年为5.32，较2024年上升13.01%。</w:t>
+        <w:t>存货周转率2024年为1.69，较2023年下降17.46%。</w:t>
       </w:r>
     </w:p>
     <w:p>
       <w:r>
-        <w:t>总资产周转率2025年为0.63，较2024年上升11.57%。</w:t>
+        <w:t>总资产周转率2024年为0.41，较2023年下降5.14%。</w:t>
       </w:r>
     </w:p>
     <w:p>
@@ -422,7 +446,7 @@
         <w:pStyle w:val="ListBullet"/>
       </w:pPr>
       <w:r>
-        <w:t>总资产：上升，2024 年至 2025 年累计变动 8.14%。</w:t>
+        <w:t>总资产：上升，2022 年至 2024 年累计变动 38.71%。</w:t>
       </w:r>
     </w:p>
     <w:p>
@@ -430,7 +454,7 @@
         <w:pStyle w:val="ListBullet"/>
       </w:pPr>
       <w:r>
-        <w:t>应收账款：上升，2024 年至 2025 年累计变动 11.11%。</w:t>
+        <w:t>应收账款：上升，2022 年至 2024 年累计变动 138.46%。</w:t>
       </w:r>
     </w:p>
     <w:p>
@@ -438,7 +462,7 @@
         <w:pStyle w:val="ListBullet"/>
       </w:pPr>
       <w:r>
-        <w:t>存货：上升，2024 年至 2025 年累计变动 6.48%。</w:t>
+        <w:t>存货：上升，2022 年至 2024 年累计变动 100.00%。</w:t>
       </w:r>
     </w:p>
     <w:p>
@@ -456,27 +480,27 @@
     </w:p>
     <w:p>
       <w:r>
-        <w:t>毛利率2025年为42.36%，较2024年下降0.28个百分点。</w:t>
+        <w:t>毛利率2024年为33.33%，较2023年下降3.22个百分点。</w:t>
       </w:r>
     </w:p>
     <w:p>
       <w:r>
-        <w:t>净利率2025年为3.13%，较2024年上升0.96个百分点。</w:t>
+        <w:t>净利率2024年为10.25%，较2023年下降2.03个百分点。</w:t>
       </w:r>
     </w:p>
     <w:p>
       <w:r>
-        <w:t>总资产报酬率（ROA）2025年为1.97%，较2024年上升0.75个百分点。</w:t>
+        <w:t>总资产报酬率（ROA）2024年为4.18%，较2023年下降1.10个百分点。</w:t>
       </w:r>
     </w:p>
     <w:p>
       <w:r>
-        <w:t>净资产收益率（ROE）2025年为4.40%，较2024年上升1.69个百分点。</w:t>
+        <w:t>净资产收益率（ROE）2024年为8.30%，较2023年下降1.14个百分点。</w:t>
       </w:r>
     </w:p>
     <w:p>
       <w:r>
-        <w:t>2024 年至 2025 年净资产收益率（ROE）上升，变化主要受总资产周转率影响。</w:t>
+        <w:t>2023 年至 2024 年净资产收益率（ROE）下降，变化主要受权益乘数影响。</w:t>
       </w:r>
     </w:p>
     <w:p>
@@ -494,22 +518,22 @@
     </w:p>
     <w:p>
       <w:r>
-        <w:t>营业收入增长率2025年为16.12%。</w:t>
+        <w:t>营业收入增长率2024年为11.72%，较2023年下降9.11个百分点。</w:t>
       </w:r>
     </w:p>
     <w:p>
       <w:r>
-        <w:t>净利润增长率2025年为67.54%。</w:t>
+        <w:t>净利润增长率2024年为-6.74%，较2023年下降29.50个百分点。</w:t>
       </w:r>
     </w:p>
     <w:p>
       <w:r>
-        <w:t>总资产增长率2025年为8.14%。</w:t>
+        <w:t>总资产增长率2024年为17.81%，较2023年上升0.07个百分点。</w:t>
       </w:r>
     </w:p>
     <w:p>
       <w:r>
-        <w:t>所有者权益增长率2025年为6.13%。</w:t>
+        <w:t>所有者权益增长率2024年为5.13%，较2023年下降2.01个百分点。</w:t>
       </w:r>
     </w:p>
     <w:p>
@@ -532,7 +556,7 @@
     </w:p>
     <w:p>
       <w:r>
-        <w:t>2024 年至 2025 年净资产收益率（ROE）上升，变化主要受总资产周转率影响。</w:t>
+        <w:t>2023 年至 2024 年净资产收益率（ROE）下降，变化主要受权益乘数影响。</w:t>
       </w:r>
     </w:p>
     <w:p>
@@ -545,12 +569,12 @@
     </w:p>
     <w:p>
       <w:r>
-        <w:t>现金流量质量评价：良好。</w:t>
+        <w:t>现金流量质量评价：风险较高。</w:t>
       </w:r>
     </w:p>
     <w:p>
       <w:r>
-        <w:t>经营活动现金流量净额与净利润整体匹配度尚可，仍需结合行业结算模式判断。</w:t>
+        <w:t>净利润现金含量连续低于 100%，提示利润现金含量需要关注。 经营活动现金流量净额呈下降趋势，需结合应收账款、存货和收入确认质量进一步分析。</w:t>
       </w:r>
     </w:p>
     <w:p>
@@ -563,7 +587,7 @@
     </w:p>
     <w:p>
       <w:r>
-        <w:t>本次共触发1条风险提示，其中高风险0条、中风险1条、低风险0条；优先关注：短期偿债能力下降。</w:t>
+        <w:t>本次共触发8条风险提示，其中高风险1条、中风险7条、低风险0条；优先关注：应收账款增长异常、存货增长较快、毛利率连续下降。</w:t>
       </w:r>
     </w:p>
     <w:p>
@@ -571,7 +595,63 @@
         <w:pStyle w:val="ListBullet"/>
       </w:pPr>
       <w:r>
-        <w:t>**短期偿债能力下降（中风险）**：2025 年流动比率和速动比率较上年同时下降。 提示短期偿债安全边际可能收窄。 建议：关注流动负债到期压力、受限资金和存货变现能力。</w:t>
+        <w:t>**应收账款增长异常（中风险）**：2024 年应收账款增长率 51.22%，高于营业收入增长率 11.72%。 提示赊销规模或回款压力可能上升，收入质量需结合账龄结构进一步核查。 建议：关注客户信用政策、应收账款账龄和坏账准备计提充分性。</w:t>
+      </w:r>
+    </w:p>
+    <w:p>
+      <w:pPr>
+        <w:pStyle w:val="ListBullet"/>
+      </w:pPr>
+      <w:r>
+        <w:t>**存货增长较快（中风险）**：2024 年存货增长率 46.15%，高于营业成本增长率 17.39%。 提示存货周转和跌价压力可能增加。 建议：进一步核查存货库龄、产品结构和跌价准备计提情况。</w:t>
+      </w:r>
+    </w:p>
+    <w:p>
+      <w:pPr>
+        <w:pStyle w:val="ListBullet"/>
+      </w:pPr>
+      <w:r>
+        <w:t>**毛利率连续下降（中风险）**：毛利率近三年连续下降。 提示产品竞争力或成本控制可能承压。 建议：关注售价、原材料成本、产品结构和费用转嫁能力。</w:t>
+      </w:r>
+    </w:p>
+    <w:p>
+      <w:pPr>
+        <w:pStyle w:val="ListBullet"/>
+      </w:pPr>
+      <w:r>
+        <w:t>**资产负债率持续上升（中风险）**：资产负债率近三年持续上升。 提示偿债压力和财务弹性需关注。 建议：进一步区分金融性负债与经营性负债，并关注债务期限结构。</w:t>
+      </w:r>
+    </w:p>
+    <w:p>
+      <w:pPr>
+        <w:pStyle w:val="ListBullet"/>
+      </w:pPr>
+      <w:r>
+        <w:t>**短期偿债能力下降（中风险）**：2024 年流动比率和速动比率较上年同时下降。 提示短期偿债安全边际可能收窄。 建议：关注流动负债到期压力、受限资金和存货变现能力。</w:t>
+      </w:r>
+    </w:p>
+    <w:p>
+      <w:pPr>
+        <w:pStyle w:val="ListBullet"/>
+      </w:pPr>
+      <w:r>
+        <w:t>**经营活动现金流量净额长期低于净利润（高风险）**：净利润现金含量至少两个年度低于 100%。 提示盈余质量和利润现金含量需关注。 建议：结合商业信用、应收账款回款和存货占用进一步核查。</w:t>
+      </w:r>
+    </w:p>
+    <w:p>
+      <w:pPr>
+        <w:pStyle w:val="ListBullet"/>
+      </w:pPr>
+      <w:r>
+        <w:t>**资产减值损失大幅增加（中风险）**：2024 年资产减值相关项目增长 72.22%。 提示资产质量可能承压，需关注减值测试和相关资产可收回金额。 建议：进一步核查应收、存货、商誉和长期资产减值明细。</w:t>
+      </w:r>
+    </w:p>
+    <w:p>
+      <w:pPr>
+        <w:pStyle w:val="ListBullet"/>
+      </w:pPr>
+      <w:r>
+        <w:t>**非经常性损益影响较大（中风险）**：2024 年非经常性损益占净利润比例约 25.30%。 提示利润可持续性需关注。 建议：重点比较扣非净利润和经常性业务盈利能力。</w:t>
       </w:r>
     </w:p>
     <w:p>
@@ -592,7 +672,39 @@
         <w:pStyle w:val="ListBullet"/>
       </w:pPr>
       <w:r>
-        <w:t>短期偿债能力下降：关注流动负债到期压力、受限资金和存货变现能力。</w:t>
+        <w:t>应收账款增长异常：关注客户信用政策、应收账款账龄和坏账准备计提充分性。</w:t>
+      </w:r>
+    </w:p>
+    <w:p>
+      <w:pPr>
+        <w:pStyle w:val="ListBullet"/>
+      </w:pPr>
+      <w:r>
+        <w:t>存货增长较快：进一步核查存货库龄、产品结构和跌价准备计提情况。</w:t>
+      </w:r>
+    </w:p>
+    <w:p>
+      <w:pPr>
+        <w:pStyle w:val="ListBullet"/>
+      </w:pPr>
+      <w:r>
+        <w:t>毛利率连续下降：关注售价、原材料成本、产品结构和费用转嫁能力。</w:t>
+      </w:r>
+    </w:p>
+    <w:p>
+      <w:pPr>
+        <w:pStyle w:val="ListBullet"/>
+      </w:pPr>
+      <w:r>
+        <w:t>资产负债率持续上升：进一步区分金融性负债与经营性负债，并关注债务期限结构。</w:t>
+      </w:r>
+    </w:p>
+    <w:p>
+      <w:pPr>
+        <w:pStyle w:val="ListBullet"/>
+      </w:pPr>
+      <w:r>
+        <w:t>现金流量质量：重点核查应收账款回款、存货占用和收入确认节奏。</w:t>
       </w:r>
     </w:p>
     <w:p>
@@ -613,102 +725,102 @@
     </w:p>
     <w:p>
       <w:r>
-        <w:t>| 指标类别   | 指标名称        | 2024    | 2025    |</w:t>
+        <w:t>| 指标类别     | 指标名称             | 2022     | 2023    | 2024   |</w:t>
       </w:r>
     </w:p>
     <w:p>
       <w:r>
-        <w:t>|:-------|:------------|:--------|:--------|</w:t>
+        <w:t>|:-------------|:---------------------|:---------|:--------|:-------|</w:t>
       </w:r>
     </w:p>
     <w:p>
       <w:r>
-        <w:t>| 偿债能力   | 权益乘数        | 2.22    | 2.26    |</w:t>
+        <w:t>| 偿债能力     | 权益乘数             | 1.70     | 1.87    | 2.10   |</w:t>
       </w:r>
     </w:p>
     <w:p>
       <w:r>
-        <w:t>| 偿债能力   | 流动比率        | 1.57    | 1.37    |</w:t>
+        <w:t>| 偿债能力     | 流动比率             | 1.97     | 1.81    | 1.66   |</w:t>
       </w:r>
     </w:p>
     <w:p>
       <w:r>
-        <w:t>| 偿债能力   | 资产负债率       | 54.88%  | 55.72%  |</w:t>
+        <w:t>| 偿债能力     | 资产负债率           | 41.29%   | 46.58%  | 52.33% |</w:t>
       </w:r>
     </w:p>
     <w:p>
       <w:r>
-        <w:t>| 偿债能力   | 速动比率        | 1.38    | 1.20    |</w:t>
+        <w:t>| 偿债能力     | 速动比率             | 1.47     | 1.25    | 0.98   |</w:t>
       </w:r>
     </w:p>
     <w:p>
       <w:r>
-        <w:t>| 成长能力   | 净利润增长率      | 数据缺失    | 67.54%  |</w:t>
+        <w:t>| 成长能力     | 净利润增长率         | 数据缺失 | 22.76%  | -6.74% |</w:t>
       </w:r>
     </w:p>
     <w:p>
       <w:r>
-        <w:t>| 成长能力   | 总资产增长率      | 数据缺失    | 8.14%   |</w:t>
+        <w:t>| 成长能力     | 总资产增长率         | 数据缺失 | 17.74%  | 17.81% |</w:t>
       </w:r>
     </w:p>
     <w:p>
       <w:r>
-        <w:t>| 成长能力   | 所有者权益增长率    | 数据缺失    | 6.13%   |</w:t>
+        <w:t>| 成长能力     | 所有者权益增长率     | 数据缺失 | 7.14%   | 5.13%  |</w:t>
       </w:r>
     </w:p>
     <w:p>
       <w:r>
-        <w:t>| 成长能力   | 营业收入增长率     | 数据缺失    | 16.12%  |</w:t>
+        <w:t>| 成长能力     | 营业收入增长率       | 数据缺失 | 20.83%  | 11.72% |</w:t>
       </w:r>
     </w:p>
     <w:p>
       <w:r>
-        <w:t>| 现金流量质量 | 净利润现金含量     | 492.11% | 377.66% |</w:t>
+        <w:t>| 现金流量质量 | 净利润现金含量       | 110.34%  | 70.22%  | 59.04% |</w:t>
       </w:r>
     </w:p>
     <w:p>
       <w:r>
-        <w:t>| 现金流量质量 | 经营现金流量收入比率  | 10.69%  | 11.84%  |</w:t>
+        <w:t>| 现金流量质量 | 经营现金流量收入比率 | 13.33%   | 8.62%   | 6.05%  |</w:t>
       </w:r>
     </w:p>
     <w:p>
       <w:r>
-        <w:t>| 现金流量质量 | 销售收现比率      | 98.14%  | 101.13% |</w:t>
+        <w:t>| 现金流量质量 | 销售收现比率         | 108.33%  | 103.45% | 97.53% |</w:t>
       </w:r>
     </w:p>
     <w:p>
       <w:r>
-        <w:t>| 盈利能力   | 净利率         | 2.17%   | 3.13%   |</w:t>
+        <w:t>| 盈利能力     | 净利率               | 12.08%   | 12.28%  | 10.25% |</w:t>
       </w:r>
     </w:p>
     <w:p>
       <w:r>
-        <w:t>| 盈利能力   | 净资产收益率（ROE） | 2.71%   | 4.40%   |</w:t>
+        <w:t>| 盈利能力     | 净资产收益率（ROE）  | 7.97%    | 9.44%   | 8.30%  |</w:t>
       </w:r>
     </w:p>
     <w:p>
       <w:r>
-        <w:t>| 盈利能力   | 总资产报酬率（ROA） | 1.22%   | 1.97%   |</w:t>
+        <w:t>| 盈利能力     | 总资产报酬率（ROA）  | 4.68%    | 5.27%   | 4.18%  |</w:t>
       </w:r>
     </w:p>
     <w:p>
       <w:r>
-        <w:t>| 盈利能力   | 毛利率         | 42.63%  | 42.36%  |</w:t>
+        <w:t>| 盈利能力     | 毛利率               | 40.00%   | 36.55%  | 33.33% |</w:t>
       </w:r>
     </w:p>
     <w:p>
       <w:r>
-        <w:t>| 营运能力   | 存货周转率       | 4.70    | 5.32    |</w:t>
+        <w:t>| 营运能力     | 存货周转率           | 1.89     | 2.04    | 1.69   |</w:t>
       </w:r>
     </w:p>
     <w:p>
       <w:r>
-        <w:t>| 营运能力   | 应收账款周转率     | 1.59    | 1.75    |</w:t>
+        <w:t>| 营运能力     | 应收账款周转率       | 4.62     | 4.33    | 3.15   |</w:t>
       </w:r>
     </w:p>
     <w:p>
       <w:r>
-        <w:t>| 营运能力   | 总资产周转率      | 0.56    | 0.63    |</w:t>
+        <w:t>| 营运能力     | 总资产周转率         | 0.39     | 0.43    | 0.41   |</w:t>
       </w:r>
     </w:p>
     <w:p>
@@ -740,7 +852,7 @@
         <w:pStyle w:val="ListBullet"/>
       </w:pPr>
       <w:r>
-        <w:t>3. file_loader：完成，读取 15 行、3 列。</w:t>
+        <w:t>3. file_loader：完成，读取 15 行、4 列。</w:t>
       </w:r>
     </w:p>
     <w:p>
@@ -748,7 +860,7 @@
         <w:pStyle w:val="ListBullet"/>
       </w:pPr>
       <w:r>
-        <w:t>4. pdf_parser：完成，PDF 解析完成：2.54MB，共301页，已抽取前200页。</w:t>
+        <w:t>4. pdf_parser：跳过，未启用或未上传 PDF。</w:t>
       </w:r>
     </w:p>
     <w:p>
@@ -756,7 +868,7 @@
         <w:pStyle w:val="ListBullet"/>
       </w:pPr>
       <w:r>
-        <w:t>5. data_cleaner：完成，识别 15 个标准科目、2 个年度。</w:t>
+        <w:t>5. data_cleaner：完成，识别 15 个标准科目、3 个年度。</w:t>
       </w:r>
     </w:p>
     <w:p>
@@ -764,7 +876,7 @@
         <w:pStyle w:val="ListBullet"/>
       </w:pPr>
       <w:r>
-        <w:t>6. data_validator：完成，数据校验完成：通过 7 项，关注 0 项，异常 0 项。</w:t>
+        <w:t>6. data_validator：完成，数据校验完成：通过 10 项，关注 0 项，异常 0 项。</w:t>
       </w:r>
     </w:p>
     <w:p>
@@ -772,7 +884,7 @@
         <w:pStyle w:val="ListBullet"/>
       </w:pPr>
       <w:r>
-        <w:t>7. ratio_calculator：完成，生成 36 条指标记录。</w:t>
+        <w:t>7. ratio_calculator：完成，生成 54 条指标记录。</w:t>
       </w:r>
     </w:p>
     <w:p>
@@ -788,7 +900,7 @@
         <w:pStyle w:val="ListBullet"/>
       </w:pPr>
       <w:r>
-        <w:t>9. dupont_analyzer：完成，2024 年至 2025 年净资产收益率（ROE）上升，变化主要受总资产周转率影响。</w:t>
+        <w:t>9. dupont_analyzer：完成，2023 年至 2024 年净资产收益率（ROE）下降，变化主要受权益乘数影响。</w:t>
       </w:r>
     </w:p>
     <w:p>
@@ -796,7 +908,7 @@
         <w:pStyle w:val="ListBullet"/>
       </w:pPr>
       <w:r>
-        <w:t>10. cashflow_analyzer：完成，现金流量质量评价：良好</w:t>
+        <w:t>10. cashflow_analyzer：完成，现金流量质量评价：风险较高</w:t>
       </w:r>
     </w:p>
     <w:p>
@@ -804,7 +916,7 @@
         <w:pStyle w:val="ListBullet"/>
       </w:pPr>
       <w:r>
-        <w:t>11. risk_detector：完成，触发 1 条风险提示。</w:t>
+        <w:t>11. risk_detector：完成，触发 8 条风险提示。</w:t>
       </w:r>
     </w:p>
     <w:p>

</xml_diff>